<commit_message>
Formatting changes, which required splitting up drawings
</commit_message>
<xml_diff>
--- a/Interior_Trim/door_install.docx
+++ b/Interior_Trim/door_install.docx
@@ -111,7 +111,7 @@
         <w:t xml:space="preserve">— Measuring Tape</w:t>
       </w:r>
       <w:r>
-        <w:t xml:space="preserve"> </w:t>
+        <w:br/>
       </w:r>
       <w:r>
         <w:t xml:space="preserve">— Pencil</w:t>
@@ -152,7 +152,7 @@
         <w:t xml:space="preserve">— Measuring Tape</w:t>
       </w:r>
       <w:r>
-        <w:t xml:space="preserve"> </w:t>
+        <w:br/>
       </w:r>
       <w:r>
         <w:t xml:space="preserve">— Pencil</w:t>
@@ -315,7 +315,7 @@
         </w:numPr>
       </w:pPr>
       <w:r>
-        <w:t xml:space="preserve">Make certain that the flooring does not extend more than an inch into the door opening.</w:t>
+        <w:t xml:space="preserve">The flooring should extend through the doorway to the T1-11 siding. If it does not, ask for help.</w:t>
       </w:r>
     </w:p>
     <w:p>
@@ -406,7 +406,6 @@
     </w:p>
     <w:p>
       <w:pPr>
-        <w:pStyle w:val="Compact"/>
         <w:numPr>
           <w:ilvl w:val="0"/>
           <w:numId w:val="1004"/>
@@ -418,7 +417,6 @@
     </w:p>
     <w:p>
       <w:pPr>
-        <w:pStyle w:val="Compact"/>
         <w:numPr>
           <w:ilvl w:val="0"/>
           <w:numId w:val="1004"/>
@@ -430,7 +428,6 @@
     </w:p>
     <w:p>
       <w:pPr>
-        <w:pStyle w:val="Compact"/>
         <w:numPr>
           <w:ilvl w:val="0"/>
           <w:numId w:val="1004"/>
@@ -442,7 +439,6 @@
     </w:p>
     <w:p>
       <w:pPr>
-        <w:pStyle w:val="Compact"/>
         <w:numPr>
           <w:ilvl w:val="0"/>
           <w:numId w:val="1004"/>
@@ -454,7 +450,6 @@
     </w:p>
     <w:p>
       <w:pPr>
-        <w:pStyle w:val="Compact"/>
         <w:numPr>
           <w:ilvl w:val="0"/>
           <w:numId w:val="1004"/>
@@ -479,12 +474,17 @@
         <w:t xml:space="preserve"> </w:t>
       </w:r>
       <w:r>
+        <w:t xml:space="preserve">— Adjust side shims so the gap at the top is the same across door width</w:t>
+      </w:r>
+      <w:r>
+        <w:br/>
+      </w:r>
+      <w:r>
         <w:t xml:space="preserve">shims and just above doorknob opening</w:t>
       </w:r>
     </w:p>
     <w:p>
       <w:pPr>
-        <w:pStyle w:val="Compact"/>
         <w:numPr>
           <w:ilvl w:val="0"/>
           <w:numId w:val="1004"/>
@@ -499,61 +499,44 @@
       <w:r>
         <w:t xml:space="preserve">— Open &amp; close door - should not hit door frame (~1/8” gap)</w:t>
       </w:r>
+    </w:p>
+    <w:p>
+      <w:pPr>
+        <w:numPr>
+          <w:ilvl w:val="0"/>
+          <w:numId w:val="1004"/>
+        </w:numPr>
+      </w:pPr>
+      <w:r>
+        <w:t xml:space="preserve">Screw door frame to the opening on the hinge side</w:t>
+      </w:r>
+      <w:r>
+        <w:br/>
+      </w:r>
+      <w:r>
+        <w:t xml:space="preserve">— open the door</w:t>
+      </w:r>
+      <w:r>
+        <w:br/>
+      </w:r>
+      <w:r>
+        <w:t xml:space="preserve">— helper holds weatherstripping out of the way</w:t>
+      </w:r>
+      <w:r>
+        <w:br/>
+      </w:r>
+      <w:r>
+        <w:t xml:space="preserve">— make sure door molding is tight against the siding</w:t>
+      </w:r>
       <w:r>
         <w:t xml:space="preserve"> </w:t>
       </w:r>
       <w:r>
-        <w:t xml:space="preserve">— Adjust hinge side shims so the gap at the top is the same across door width</w:t>
-      </w:r>
-      <w:r>
-        <w:br/>
-      </w:r>
-    </w:p>
-    <w:p>
-      <w:pPr>
-        <w:pStyle w:val="Compact"/>
-        <w:numPr>
-          <w:ilvl w:val="0"/>
-          <w:numId w:val="1004"/>
-        </w:numPr>
-      </w:pPr>
-      <w:r>
-        <w:t xml:space="preserve">Screw door frame to the opening on the hinge side</w:t>
-      </w:r>
-      <w:r>
-        <w:br/>
-      </w:r>
-      <w:r>
-        <w:t xml:space="preserve">— open the door</w:t>
-      </w:r>
-      <w:r>
-        <w:br/>
-      </w:r>
-      <w:r>
-        <w:t xml:space="preserve">— helper holds weatherstripping out of the way</w:t>
-      </w:r>
-      <w:r>
-        <w:br/>
-      </w:r>
-      <w:r>
-        <w:t xml:space="preserve">— make sure door molding is tight against the siding</w:t>
-      </w:r>
-      <w:r>
-        <w:t xml:space="preserve"> </w:t>
-      </w:r>
-      <w:r>
-        <w:t xml:space="preserve">— install 3” (brown) screws just behind the weatherstripping at the</w:t>
-      </w:r>
-      <w:r>
-        <w:t xml:space="preserve"> </w:t>
-      </w:r>
-      <w:r>
-        <w:t xml:space="preserve">height of the center of each shim, starting at the top</w:t>
-      </w:r>
-    </w:p>
-    <w:p>
-      <w:pPr>
-        <w:pStyle w:val="Compact"/>
+        <w:t xml:space="preserve">— install 3” (brown) screws just behind the weatherstripping at the height of the center of each shim, starting at the top</w:t>
+      </w:r>
+    </w:p>
+    <w:p>
+      <w:pPr>
         <w:numPr>
           <w:ilvl w:val="0"/>
           <w:numId w:val="1004"/>
@@ -666,13 +649,13 @@
         <w:br/>
       </w:r>
       <w:r>
-        <w:t xml:space="preserve">— Angle drill towards outside, to assure that screw will go into the framing</w:t>
-      </w:r>
-      <w:r>
-        <w:br/>
-      </w:r>
-      <w:r>
-        <w:t xml:space="preserve">— Install 3” screws in both drilled holes, and through the shims</w:t>
+        <w:t xml:space="preserve">— Angle drill towards outside of the home, to assure that screws will go into the framing</w:t>
+      </w:r>
+      <w:r>
+        <w:br/>
+      </w:r>
+      <w:r>
+        <w:t xml:space="preserve">— Install 3” screws in both drilled holes, and through the shims. Make sure that the screw heads are below the surface of the door frame.</w:t>
       </w:r>
     </w:p>
     <w:p>
@@ -684,7 +667,7 @@
         </w:numPr>
       </w:pPr>
       <w:r>
-        <w:t xml:space="preserve">If space above the door is small use shims to make it even, if large</w:t>
+        <w:t xml:space="preserve">If space above the door is narrow, use shims to make it even, if large</w:t>
       </w:r>
       <w:r>
         <w:t xml:space="preserve"> </w:t>
@@ -778,13 +761,7 @@
         </w:numPr>
       </w:pPr>
       <w:r>
-        <w:t xml:space="preserve">Trim off the protruding ends of the shims, flush with the wall</w:t>
-      </w:r>
-      <w:r>
-        <w:t xml:space="preserve"> </w:t>
-      </w:r>
-      <w:r>
-        <w:t xml:space="preserve">plywood. Use a box knife to score the shim, and then snap it off.</w:t>
+        <w:t xml:space="preserve">Trim off the protruding ends of the shims, flush with the wall plywood. Use a box knife to score the shim, and then snap it off.</w:t>
       </w:r>
     </w:p>
     <w:p>
@@ -796,31 +773,7 @@
         </w:numPr>
       </w:pPr>
       <w:r>
-        <w:t xml:space="preserve">Remove the weatherstripping from the top and sides of the door</w:t>
-      </w:r>
-      <w:r>
-        <w:t xml:space="preserve"> </w:t>
-      </w:r>
-      <w:r>
-        <w:t xml:space="preserve">frame, using the wide-jawed pliers to get each strip started. Save</w:t>
-      </w:r>
-      <w:r>
-        <w:t xml:space="preserve"> </w:t>
-      </w:r>
-      <w:r>
-        <w:t xml:space="preserve">these pieces of weatherstripping. There is a collection on top of</w:t>
-      </w:r>
-      <w:r>
-        <w:t xml:space="preserve"> </w:t>
-      </w:r>
-      <w:r>
-        <w:t xml:space="preserve">the shelving between Paint Bay C and the area where personal</w:t>
-      </w:r>
-      <w:r>
-        <w:t xml:space="preserve"> </w:t>
-      </w:r>
-      <w:r>
-        <w:t xml:space="preserve">belongings are stowed.</w:t>
+        <w:t xml:space="preserve">Remove the weatherstripping from the top and sides of the door frame, using the wide-jawed pliers to get each strip started. Save these pieces of weatherstripping. There is a collection on top of the shelving between Paint Bay C and the area where personal belongings are stowed.</w:t>
       </w:r>
     </w:p>
     <w:p>
@@ -915,52 +868,88 @@
       <w:pBdr>
         <w:top w:val="single" w:sz="4" w:space="1" w:color="BFBFBF" w:themeColor="background1" w:themeShade="BF"/>
       </w:pBdr>
+      <w:rPr>
+        <w:sz w:val="22"/>
+      </w:rPr>
     </w:pPr>
     <w:r>
+      <w:rPr>
+        <w:sz w:val="22"/>
+      </w:rPr>
       <w:t>Sound Foundations NW</w:t>
     </w:r>
     <w:r>
+      <w:rPr>
+        <w:sz w:val="22"/>
+      </w:rPr>
       <w:ptab w:relativeTo="margin" w:alignment="center" w:leader="none"/>
     </w:r>
     <w:r>
+      <w:rPr>
+        <w:sz w:val="22"/>
+      </w:rPr>
       <w:fldChar w:fldCharType="begin"/>
     </w:r>
     <w:r>
+      <w:rPr>
+        <w:sz w:val="22"/>
+      </w:rPr>
       <w:instrText xml:space="preserve"> SAVEDATE  \@ "d MMMM yyyy"  \* MERGEFORMAT </w:instrText>
     </w:r>
     <w:r>
+      <w:rPr>
+        <w:sz w:val="22"/>
+      </w:rPr>
       <w:fldChar w:fldCharType="separate"/>
     </w:r>
     <w:r>
       <w:rPr>
         <w:noProof/>
-      </w:rPr>
-      <w:t>24 January 2025</w:t>
+        <w:sz w:val="22"/>
+      </w:rPr>
+      <w:t>30 January 2025</w:t>
     </w:r>
     <w:r>
+      <w:rPr>
+        <w:sz w:val="22"/>
+      </w:rPr>
       <w:fldChar w:fldCharType="end"/>
     </w:r>
     <w:r>
+      <w:rPr>
+        <w:sz w:val="22"/>
+      </w:rPr>
       <w:ptab w:relativeTo="margin" w:alignment="right" w:leader="none"/>
     </w:r>
     <w:r>
+      <w:rPr>
+        <w:sz w:val="22"/>
+      </w:rPr>
       <w:fldChar w:fldCharType="begin"/>
     </w:r>
     <w:r>
+      <w:rPr>
+        <w:sz w:val="22"/>
+      </w:rPr>
       <w:instrText xml:space="preserve"> PAGE   \* MERGEFORMAT </w:instrText>
     </w:r>
     <w:r>
+      <w:rPr>
+        <w:sz w:val="22"/>
+      </w:rPr>
       <w:fldChar w:fldCharType="separate"/>
     </w:r>
     <w:r>
       <w:rPr>
         <w:noProof/>
+        <w:sz w:val="22"/>
       </w:rPr>
       <w:t>1</w:t>
     </w:r>
     <w:r>
       <w:rPr>
         <w:noProof/>
+        <w:sz w:val="22"/>
       </w:rPr>
       <w:fldChar w:fldCharType="end"/>
     </w:r>
@@ -1746,6 +1735,10 @@
   <w:style w:default="1" w:styleId="Normal" w:type="paragraph">
     <w:name w:val="Normal"/>
     <w:qFormat/>
+    <w:rsid w:val="0033722B"/>
+    <w:rPr>
+      <w:sz w:val="28"/>
+    </w:rPr>
   </w:style>
   <w:style w:styleId="Heading1" w:type="paragraph">
     <w:name w:val="heading 1"/>
@@ -1797,6 +1790,50 @@
       <w:szCs w:val="36"/>
     </w:rPr>
   </w:style>
+  <w:style w:styleId="Heading3" w:type="paragraph">
+    <w:name w:val="heading 3"/>
+    <w:basedOn w:val="Normal"/>
+    <w:next w:val="Normal"/>
+    <w:link w:val="Heading3Char"/>
+    <w:uiPriority w:val="9"/>
+    <w:unhideWhenUsed/>
+    <w:qFormat/>
+    <w:rsid w:val="005B3D4E"/>
+    <w:pPr>
+      <w:keepNext/>
+      <w:keepLines/>
+      <w:spacing w:after="0" w:before="40"/>
+      <w:outlineLvl w:val="2"/>
+    </w:pPr>
+    <w:rPr>
+      <w:rFonts w:ascii="Arial" w:cstheme="majorBidi" w:eastAsiaTheme="majorEastAsia" w:hAnsi="Arial"/>
+      <w:color w:themeColor="accent1" w:themeShade="7F" w:val="243F60"/>
+      <w:sz w:val="32"/>
+      <w:szCs w:val="24"/>
+    </w:rPr>
+  </w:style>
+  <w:style w:styleId="Heading4" w:type="paragraph">
+    <w:name w:val="heading 4"/>
+    <w:basedOn w:val="Normal"/>
+    <w:next w:val="Normal"/>
+    <w:link w:val="Heading4Char"/>
+    <w:uiPriority w:val="9"/>
+    <w:unhideWhenUsed/>
+    <w:qFormat/>
+    <w:rsid w:val="005B3D4E"/>
+    <w:pPr>
+      <w:keepNext/>
+      <w:keepLines/>
+      <w:spacing w:after="0" w:before="40"/>
+      <w:outlineLvl w:val="3"/>
+    </w:pPr>
+    <w:rPr>
+      <w:rFonts w:asciiTheme="majorHAnsi" w:cstheme="majorBidi" w:eastAsiaTheme="majorEastAsia" w:hAnsiTheme="majorHAnsi"/>
+      <w:i/>
+      <w:iCs/>
+      <w:color w:themeColor="accent1" w:themeShade="BF" w:val="365F91"/>
+    </w:rPr>
+  </w:style>
   <w:style w:default="1" w:styleId="DefaultParagraphFont" w:type="character">
     <w:name w:val="Default Paragraph Font"/>
     <w:uiPriority w:val="1"/>
@@ -1985,6 +2022,44 @@
       <w:ind w:left="720"/>
       <w:contextualSpacing/>
     </w:pPr>
+  </w:style>
+  <w:style w:customStyle="1" w:styleId="Heading3Char" w:type="character">
+    <w:name w:val="Heading 3 Char"/>
+    <w:basedOn w:val="DefaultParagraphFont"/>
+    <w:link w:val="Heading3"/>
+    <w:uiPriority w:val="9"/>
+    <w:rsid w:val="005B3D4E"/>
+    <w:rPr>
+      <w:rFonts w:ascii="Arial" w:cstheme="majorBidi" w:eastAsiaTheme="majorEastAsia" w:hAnsi="Arial"/>
+      <w:color w:themeColor="accent1" w:themeShade="7F" w:val="243F60"/>
+      <w:sz w:val="32"/>
+      <w:szCs w:val="24"/>
+    </w:rPr>
+  </w:style>
+  <w:style w:customStyle="1" w:styleId="Heading4Char" w:type="character">
+    <w:name w:val="Heading 4 Char"/>
+    <w:basedOn w:val="DefaultParagraphFont"/>
+    <w:link w:val="Heading4"/>
+    <w:uiPriority w:val="9"/>
+    <w:rsid w:val="005B3D4E"/>
+    <w:rPr>
+      <w:rFonts w:asciiTheme="majorHAnsi" w:cstheme="majorBidi" w:eastAsiaTheme="majorEastAsia" w:hAnsiTheme="majorHAnsi"/>
+      <w:i/>
+      <w:iCs/>
+      <w:color w:themeColor="accent1" w:themeShade="BF" w:val="365F91"/>
+    </w:rPr>
+  </w:style>
+  <w:style w:styleId="NoSpacing" w:type="paragraph">
+    <w:name w:val="No Spacing"/>
+    <w:uiPriority w:val="1"/>
+    <w:qFormat/>
+    <w:rsid w:val="0033722B"/>
+    <w:pPr>
+      <w:spacing w:after="0" w:line="240" w:lineRule="auto"/>
+    </w:pPr>
+    <w:rPr>
+      <w:sz w:val="28"/>
+    </w:rPr>
   </w:style>
   <w:style w:type="paragraph" w:customStyle="1" w:styleId="SourceCode">
     <w:name w:val="Source Code"/>

</xml_diff>

<commit_message>
Revised doorway floor attachment to allow main floor to float
</commit_message>
<xml_diff>
--- a/Interior_Trim/door_install.docx
+++ b/Interior_Trim/door_install.docx
@@ -281,19 +281,7 @@
         </w:numPr>
       </w:pPr>
       <w:r>
-        <w:t xml:space="preserve">Make sure that the top and side door moldings are flush. Clamp if necessary.</w:t>
-      </w:r>
-    </w:p>
-    <w:p>
-      <w:pPr>
-        <w:pStyle w:val="Compact"/>
-        <w:numPr>
-          <w:ilvl w:val="0"/>
-          <w:numId w:val="1002"/>
-        </w:numPr>
-      </w:pPr>
-      <w:r>
-        <w:t xml:space="preserve">Install a 3” (brown) screw in these two corner spots</w:t>
+        <w:t xml:space="preserve">Make sure that the top and side door moldings are flush. Clamp if necessary. Install a 3” (brown) screw in these two corner spots</w:t>
       </w:r>
     </w:p>
     <w:bookmarkEnd w:id="21"/>
@@ -315,7 +303,7 @@
         </w:numPr>
       </w:pPr>
       <w:r>
-        <w:t xml:space="preserve">The flooring should extend through the doorway to the T1-11 siding. If it does not, ask for help.</w:t>
+        <w:t xml:space="preserve">The flooring should extend only 3/4” into the doorway, measured from the interior of the front wall plywood. If it does not, ask for help.</w:t>
       </w:r>
     </w:p>
     <w:p>
@@ -327,7 +315,7 @@
         </w:numPr>
       </w:pPr>
       <w:r>
-        <w:t xml:space="preserve">Cut a 54” length of flexible flashing (Peel-n-Stick), and install it in the bottom of the doorway, with about 8” running up each side of the opening, and half the width sticking outside the home.</w:t>
+        <w:t xml:space="preserve">Install a set of 4 short chunks of flexible flooring (~3” wide) flush with the outside edge of the exterior siding, leaving a gap with the interior flooring.</w:t>
       </w:r>
     </w:p>
     <w:p>
@@ -339,12 +327,19 @@
         </w:numPr>
       </w:pPr>
       <w:r>
+        <w:t xml:space="preserve">Cut a 54” length of flexible flashing (Peel-n-Stick), and install it in the bottom of the doorway over these chunks of flooring, with about 8” running up each side of the opening, and half the width sticking outside the home.</w:t>
+      </w:r>
+    </w:p>
+    <w:p>
+      <w:pPr>
+        <w:pStyle w:val="Compact"/>
+        <w:numPr>
+          <w:ilvl w:val="0"/>
+          <w:numId w:val="1003"/>
+        </w:numPr>
+      </w:pPr>
+      <w:r>
         <w:t xml:space="preserve">Slit the corners, and fold the outer half of the flashing down and to the sides of the opening.</w:t>
-      </w:r>
-    </w:p>
-    <w:p>
-      <w:r>
-        <w:br w:type="page"/>
       </w:r>
     </w:p>
     <w:p>
@@ -497,7 +492,7 @@
         <w:br/>
       </w:r>
       <w:r>
-        <w:t xml:space="preserve">— Open &amp; close door - should not hit door frame (~1/8” gap)</w:t>
+        <w:t xml:space="preserve">— Open &amp; close door - it should not hit door frame (~1/8” gap)</w:t>
       </w:r>
     </w:p>
     <w:p>
@@ -573,7 +568,7 @@
         <w:br/>
       </w:r>
       <w:r>
-        <w:t xml:space="preserve">— adjust shims above and below latch hole so the gap is approximately 1/8” between door and door jamb</w:t>
+        <w:t xml:space="preserve">— adjust shims above and below latch hole so the gap between door and door jamb is approximately 1/8”</w:t>
       </w:r>
     </w:p>
     <w:p>
@@ -685,13 +680,7 @@
         </w:numPr>
       </w:pPr>
       <w:r>
-        <w:t xml:space="preserve">Insert shims 8-10” in from each side to fill space between top of</w:t>
-      </w:r>
-      <w:r>
-        <w:t xml:space="preserve"> </w:t>
-      </w:r>
-      <w:r>
-        <w:t xml:space="preserve">door frame and doorway framing</w:t>
+        <w:t xml:space="preserve">Insert shims 8-10” in from each side to fill space between top of door frame and doorway framing</w:t>
       </w:r>
     </w:p>
     <w:p>
@@ -715,13 +704,7 @@
         </w:numPr>
       </w:pPr>
       <w:r>
-        <w:t xml:space="preserve">Install three silver screws into the holes in the metal threshold.</w:t>
-      </w:r>
-      <w:r>
-        <w:t xml:space="preserve"> </w:t>
-      </w:r>
-      <w:r>
-        <w:t xml:space="preserve">Do not overdrive these screws; it will distort the threshold.</w:t>
+        <w:t xml:space="preserve">Install three silver screws into the holes in the metal threshold. Do not overdrive these screws; it will distort the threshold.</w:t>
       </w:r>
     </w:p>
     <w:bookmarkEnd w:id="29"/>
@@ -840,7 +823,7 @@
       <w:pgSz w:code="1" w:h="15840" w:w="12240"/>
       <w:pgMar w:bottom="1440" w:footer="708" w:gutter="0" w:header="708" w:left="1440" w:right="1440" w:top="1440"/>
       <w:cols w:space="708"/>
-      <w:docGrid w:linePitch="360"/>
+      <w:docGrid w:linePitch="381"/>
     </w:sectPr>
   </w:body>
 </w:document>
@@ -866,7 +849,7 @@
     <w:pPr>
       <w:pStyle w:val="Footer"/>
       <w:pBdr>
-        <w:top w:val="single" w:sz="4" w:space="1" w:color="BFBFBF" w:themeColor="background1" w:themeShade="BF"/>
+        <w:top w:val="single" w:sz="4" w:space="1" w:color="auto"/>
       </w:pBdr>
       <w:rPr>
         <w:sz w:val="22"/>
@@ -888,6 +871,12 @@
       <w:rPr>
         <w:sz w:val="22"/>
       </w:rPr>
+      <w:t xml:space="preserve"> </w:t>
+    </w:r>
+    <w:r>
+      <w:rPr>
+        <w:sz w:val="22"/>
+      </w:rPr>
       <w:fldChar w:fldCharType="begin"/>
     </w:r>
     <w:r>
@@ -907,7 +896,7 @@
         <w:noProof/>
         <w:sz w:val="22"/>
       </w:rPr>
-      <w:t>30 January 2025</w:t>
+      <w:t>12 March 2025</w:t>
     </w:r>
     <w:r>
       <w:rPr>
@@ -919,6 +908,12 @@
       <w:rPr>
         <w:sz w:val="22"/>
       </w:rPr>
+      <w:t xml:space="preserve"> </w:t>
+    </w:r>
+    <w:r>
+      <w:rPr>
+        <w:sz w:val="22"/>
+      </w:rPr>
       <w:ptab w:relativeTo="margin" w:alignment="right" w:leader="none"/>
     </w:r>
     <w:r>
@@ -948,7 +943,6 @@
     </w:r>
     <w:r>
       <w:rPr>
-        <w:noProof/>
         <w:sz w:val="22"/>
       </w:rPr>
       <w:fldChar w:fldCharType="end"/>
@@ -1021,10 +1015,11 @@
   <w:abstractNum w15:restartNumberingAfterBreak="0" w:abstractNumId="0">
     <w:nsid w:val="5BCE4232"/>
     <w:multiLevelType w:val="hybridMultilevel"/>
-    <w:tmpl w:val="622EFD06"/>
-    <w:lvl w:ilvl="0" w:tplc="0C090001">
+    <w:tmpl w:val="C14AE192"/>
+    <w:lvl w:ilvl="0" w:tplc="4A0AC008">
       <w:start w:val="1"/>
       <w:numFmt w:val="bullet"/>
+      <w:pStyle w:val="ListParagraph"/>
       <w:lvlText w:val=""/>
       <w:lvlJc w:val="left"/>
       <w:pPr>
@@ -1310,7 +1305,7 @@
       </w:rPr>
     </w:lvl>
   </w:abstractNum>
-  <w:num w16cid:durableId="1603538387" w:numId="1">
+  <w:num w16cid:durableId="101804748" w:numId="1">
     <w:abstractNumId w:val="0"/>
   </w:num>
   <w:num w:numId="1000">
@@ -1735,7 +1730,7 @@
   <w:style w:default="1" w:styleId="Normal" w:type="paragraph">
     <w:name w:val="Normal"/>
     <w:qFormat/>
-    <w:rsid w:val="0033722B"/>
+    <w:rsid w:val="00682500"/>
     <w:rPr>
       <w:sz w:val="28"/>
     </w:rPr>
@@ -1774,7 +1769,7 @@
     <w:uiPriority w:val="9"/>
     <w:unhideWhenUsed/>
     <w:qFormat/>
-    <w:rsid w:val="00F14C3E"/>
+    <w:rsid w:val="00B467BA"/>
     <w:pPr>
       <w:keepNext/>
       <w:keepLines/>
@@ -1798,11 +1793,11 @@
     <w:uiPriority w:val="9"/>
     <w:unhideWhenUsed/>
     <w:qFormat/>
-    <w:rsid w:val="005B3D4E"/>
+    <w:rsid w:val="001716AF"/>
     <w:pPr>
       <w:keepNext/>
       <w:keepLines/>
-      <w:spacing w:after="0" w:before="40"/>
+      <w:spacing w:after="0" w:before="120"/>
       <w:outlineLvl w:val="2"/>
     </w:pPr>
     <w:rPr>
@@ -1820,18 +1815,17 @@
     <w:uiPriority w:val="9"/>
     <w:unhideWhenUsed/>
     <w:qFormat/>
-    <w:rsid w:val="005B3D4E"/>
+    <w:rsid w:val="001716AF"/>
     <w:pPr>
       <w:keepNext/>
       <w:keepLines/>
-      <w:spacing w:after="0" w:before="40"/>
+      <w:spacing w:after="0"/>
       <w:outlineLvl w:val="3"/>
     </w:pPr>
     <w:rPr>
-      <w:rFonts w:asciiTheme="majorHAnsi" w:cstheme="majorBidi" w:eastAsiaTheme="majorEastAsia" w:hAnsiTheme="majorHAnsi"/>
-      <w:i/>
+      <w:rFonts w:ascii="Arial" w:cs="Arial" w:eastAsiaTheme="majorEastAsia" w:hAnsi="Arial"/>
+      <w:bCs/>
       <w:iCs/>
-      <w:color w:themeColor="accent1" w:themeShade="BF" w:val="365F91"/>
     </w:rPr>
   </w:style>
   <w:style w:default="1" w:styleId="DefaultParagraphFont" w:type="character">
@@ -1867,7 +1861,7 @@
     <w:link w:val="HeaderChar"/>
     <w:uiPriority w:val="99"/>
     <w:unhideWhenUsed/>
-    <w:rsid w:val="00E043FD"/>
+    <w:rsid w:val="00037B15"/>
     <w:pPr>
       <w:tabs>
         <w:tab w:pos="4513" w:val="center"/>
@@ -1882,6 +1876,9 @@
     <w:link w:val="Header"/>
     <w:uiPriority w:val="99"/>
     <w:rsid w:val="00E043FD"/>
+    <w:rPr>
+      <w:sz w:val="28"/>
+    </w:rPr>
   </w:style>
   <w:style w:styleId="Footer" w:type="paragraph">
     <w:name w:val="footer"/>
@@ -1889,7 +1886,7 @@
     <w:link w:val="FooterChar"/>
     <w:uiPriority w:val="99"/>
     <w:unhideWhenUsed/>
-    <w:rsid w:val="00E043FD"/>
+    <w:rsid w:val="00037B15"/>
     <w:pPr>
       <w:tabs>
         <w:tab w:pos="4513" w:val="center"/>
@@ -1904,6 +1901,9 @@
     <w:link w:val="Footer"/>
     <w:uiPriority w:val="99"/>
     <w:rsid w:val="00E043FD"/>
+    <w:rPr>
+      <w:sz w:val="28"/>
+    </w:rPr>
   </w:style>
   <w:style w:customStyle="1" w:styleId="3CBD5A742C28424DA5172AD252E32316" w:type="paragraph">
     <w:name w:val="3CBD5A742C28424DA5172AD252E32316"/>
@@ -2002,7 +2002,7 @@
     <w:basedOn w:val="DefaultParagraphFont"/>
     <w:link w:val="Heading2"/>
     <w:uiPriority w:val="9"/>
-    <w:rsid w:val="00F14C3E"/>
+    <w:rsid w:val="00B467BA"/>
     <w:rPr>
       <w:rFonts w:cstheme="minorHAnsi" w:eastAsiaTheme="majorEastAsia"/>
       <w:b/>
@@ -2015,11 +2015,15 @@
   <w:style w:styleId="ListParagraph" w:type="paragraph">
     <w:name w:val="List Paragraph"/>
     <w:basedOn w:val="Normal"/>
+    <w:link w:val="ListParagraphChar"/>
     <w:uiPriority w:val="34"/>
     <w:qFormat/>
-    <w:rsid w:val="0085261D"/>
+    <w:rsid w:val="002E72C0"/>
     <w:pPr>
-      <w:ind w:left="720"/>
+      <w:numPr>
+        <w:numId w:val="1"/>
+      </w:numPr>
+      <w:spacing w:after="120"/>
       <w:contextualSpacing/>
     </w:pPr>
   </w:style>
@@ -2028,7 +2032,7 @@
     <w:basedOn w:val="DefaultParagraphFont"/>
     <w:link w:val="Heading3"/>
     <w:uiPriority w:val="9"/>
-    <w:rsid w:val="005B3D4E"/>
+    <w:rsid w:val="001716AF"/>
     <w:rPr>
       <w:rFonts w:ascii="Arial" w:cstheme="majorBidi" w:eastAsiaTheme="majorEastAsia" w:hAnsi="Arial"/>
       <w:color w:themeColor="accent1" w:themeShade="7F" w:val="243F60"/>
@@ -2041,22 +2045,61 @@
     <w:basedOn w:val="DefaultParagraphFont"/>
     <w:link w:val="Heading4"/>
     <w:uiPriority w:val="9"/>
-    <w:rsid w:val="005B3D4E"/>
-    <w:rPr>
-      <w:rFonts w:asciiTheme="majorHAnsi" w:cstheme="majorBidi" w:eastAsiaTheme="majorEastAsia" w:hAnsiTheme="majorHAnsi"/>
-      <w:i/>
+    <w:rsid w:val="001716AF"/>
+    <w:rPr>
+      <w:rFonts w:ascii="Arial" w:cs="Arial" w:eastAsiaTheme="majorEastAsia" w:hAnsi="Arial"/>
+      <w:bCs/>
       <w:iCs/>
-      <w:color w:themeColor="accent1" w:themeShade="BF" w:val="365F91"/>
+      <w:sz w:val="28"/>
     </w:rPr>
   </w:style>
   <w:style w:styleId="NoSpacing" w:type="paragraph">
     <w:name w:val="No Spacing"/>
     <w:uiPriority w:val="1"/>
     <w:qFormat/>
-    <w:rsid w:val="0033722B"/>
+    <w:rsid w:val="00037B15"/>
     <w:pPr>
       <w:spacing w:after="0" w:line="240" w:lineRule="auto"/>
     </w:pPr>
+    <w:rPr>
+      <w:sz w:val="28"/>
+    </w:rPr>
+  </w:style>
+  <w:style w:styleId="Revision" w:type="paragraph">
+    <w:name w:val="Revision"/>
+    <w:hidden/>
+    <w:uiPriority w:val="99"/>
+    <w:semiHidden/>
+    <w:rsid w:val="00037B15"/>
+    <w:pPr>
+      <w:spacing w:after="0" w:line="240" w:lineRule="auto"/>
+    </w:pPr>
+  </w:style>
+  <w:style w:customStyle="1" w:styleId="Bulleted" w:type="paragraph">
+    <w:name w:val="Bulleted"/>
+    <w:basedOn w:val="ListParagraph"/>
+    <w:link w:val="BulletedChar"/>
+    <w:qFormat/>
+    <w:rsid w:val="006E24A1"/>
+    <w:pPr>
+      <w:spacing w:after="0"/>
+    </w:pPr>
+  </w:style>
+  <w:style w:customStyle="1" w:styleId="ListParagraphChar" w:type="character">
+    <w:name w:val="List Paragraph Char"/>
+    <w:basedOn w:val="DefaultParagraphFont"/>
+    <w:link w:val="ListParagraph"/>
+    <w:uiPriority w:val="34"/>
+    <w:rsid w:val="006E24A1"/>
+    <w:rPr>
+      <w:sz w:val="28"/>
+    </w:rPr>
+  </w:style>
+  <w:style w:customStyle="1" w:styleId="BulletedChar" w:type="character">
+    <w:name w:val="Bulleted Char"/>
+    <w:basedOn w:val="ListParagraphChar"/>
+    <w:link w:val="Bulleted"/>
+    <w:rsid w:val="006E24A1"/>
     <w:rPr>
       <w:sz w:val="28"/>
     </w:rPr>

</xml_diff>

<commit_message>
Revised per process change on door prep, since several items duplicate work done in previous door prep, and added instructions to ensure that the door frame sits firmly on the bottom of the doorway.
</commit_message>
<xml_diff>
--- a/Interior_Trim/door_install.docx
+++ b/Interior_Trim/door_install.docx
@@ -191,13 +191,7 @@
         </w:numPr>
       </w:pPr>
       <w:r>
-        <w:t xml:space="preserve">Free a door from the shipping pallet using a Phillips-head bit on a</w:t>
-      </w:r>
-      <w:r>
-        <w:t xml:space="preserve"> </w:t>
-      </w:r>
-      <w:r>
-        <w:t xml:space="preserve">screw gun</w:t>
+        <w:t xml:space="preserve">Free a door from the shipping pallet using a Phillips-head bit on a screw gun</w:t>
       </w:r>
     </w:p>
     <w:p>
@@ -209,7 +203,13 @@
         </w:numPr>
       </w:pPr>
       <w:r>
-        <w:t xml:space="preserve">Lay the door face down on a work surface</w:t>
+        <w:t xml:space="preserve">Verify that all labeling, bottom plastic protectors, and hinge protectors have</w:t>
+      </w:r>
+      <w:r>
+        <w:t xml:space="preserve"> </w:t>
+      </w:r>
+      <w:r>
+        <w:t xml:space="preserve">been removed, and that the weatherstripping has been pulled out of the door frame.</w:t>
       </w:r>
     </w:p>
     <w:p>
@@ -221,67 +221,7 @@
         </w:numPr>
       </w:pPr>
       <w:r>
-        <w:t xml:space="preserve">Remove all labels and packaging</w:t>
-      </w:r>
-    </w:p>
-    <w:p>
-      <w:pPr>
-        <w:pStyle w:val="Compact"/>
-        <w:numPr>
-          <w:ilvl w:val="0"/>
-          <w:numId w:val="1002"/>
-        </w:numPr>
-      </w:pPr>
-      <w:r>
-        <w:t xml:space="preserve">Remove plastic protectors from door jamb at the bottom</w:t>
-      </w:r>
-    </w:p>
-    <w:p>
-      <w:pPr>
-        <w:pStyle w:val="Compact"/>
-        <w:numPr>
-          <w:ilvl w:val="0"/>
-          <w:numId w:val="1002"/>
-        </w:numPr>
-      </w:pPr>
-      <w:r>
-        <w:t xml:space="preserve">Remove any blocking behind the molding around the door frame</w:t>
-      </w:r>
-    </w:p>
-    <w:p>
-      <w:pPr>
-        <w:pStyle w:val="Compact"/>
-        <w:numPr>
-          <w:ilvl w:val="0"/>
-          <w:numId w:val="1002"/>
-        </w:numPr>
-      </w:pPr>
-      <w:r>
-        <w:t xml:space="preserve">Unscrew retaining plug where doorknob will go</w:t>
-      </w:r>
-    </w:p>
-    <w:p>
-      <w:pPr>
-        <w:pStyle w:val="Compact"/>
-        <w:numPr>
-          <w:ilvl w:val="0"/>
-          <w:numId w:val="1002"/>
-        </w:numPr>
-      </w:pPr>
-      <w:r>
-        <w:t xml:space="preserve">Using a countersink bit, drill a hole pointing down from the top of the door to the bottom in the top trim about 1” in from the edge of the trim on both sides and centered vertically</w:t>
-      </w:r>
-    </w:p>
-    <w:p>
-      <w:pPr>
-        <w:pStyle w:val="Compact"/>
-        <w:numPr>
-          <w:ilvl w:val="0"/>
-          <w:numId w:val="1002"/>
-        </w:numPr>
-      </w:pPr>
-      <w:r>
-        <w:t xml:space="preserve">Make sure that the top and side door moldings are flush. Clamp if necessary. Install a 3” (brown) screw in these two corner spots</w:t>
+        <w:t xml:space="preserve">Unscrew plug retainer where doorknob will go, leaving the plug in place</w:t>
       </w:r>
     </w:p>
     <w:bookmarkEnd w:id="21"/>
@@ -315,7 +255,7 @@
         </w:numPr>
       </w:pPr>
       <w:r>
-        <w:t xml:space="preserve">Install a set of 4 short chunks of flexible flooring (~3” wide) flush with the outside edge of the exterior siding, leaving a gap with the interior flooring.</w:t>
+        <w:t xml:space="preserve">Unless it is already there, install a piece of flexible flooring (~3-1/2” wide) flush with the outside edge of the exterior siding, leaving a gap with the interior flooring.</w:t>
       </w:r>
     </w:p>
     <w:p>
@@ -327,7 +267,7 @@
         </w:numPr>
       </w:pPr>
       <w:r>
-        <w:t xml:space="preserve">Cut a 54” length of flexible flashing (Peel-n-Stick), and install it in the bottom of the doorway over these chunks of flooring, with about 8” running up each side of the opening, and half the width sticking outside the home.</w:t>
+        <w:t xml:space="preserve">Cut a 54” length of flexible flashing (Peel-n-Stick), and install it in the bottom of the doorway over the flooring strip, with about 8” running up each side of the opening, and half the width sticking outside the home.</w:t>
       </w:r>
     </w:p>
     <w:p>
@@ -440,7 +380,19 @@
         </w:numPr>
       </w:pPr>
       <w:r>
-        <w:t xml:space="preserve">Helpers hold door frame tight against siding</w:t>
+        <w:t xml:space="preserve">Make sure that the door frame is seated firmly on the bottom of the doorway.</w:t>
+      </w:r>
+      <w:r>
+        <w:t xml:space="preserve"> </w:t>
+      </w:r>
+      <w:r>
+        <w:t xml:space="preserve">Use a prybar at the top corners if necessary to push the sides of the door frame</w:t>
+      </w:r>
+      <w:r>
+        <w:t xml:space="preserve"> </w:t>
+      </w:r>
+      <w:r>
+        <w:t xml:space="preserve">down so that they are in contact with the flooring.</w:t>
       </w:r>
     </w:p>
     <w:p>
@@ -451,31 +403,7 @@
         </w:numPr>
       </w:pPr>
       <w:r>
-        <w:t xml:space="preserve">Insert SHIMS as necessary to center the door in the opening and tighten any spaces</w:t>
-      </w:r>
-      <w:r>
-        <w:br/>
-      </w:r>
-      <w:r>
-        <w:t xml:space="preserve">— hinge side, place shims just above each hinge</w:t>
-      </w:r>
-      <w:r>
-        <w:br/>
-      </w:r>
-      <w:r>
-        <w:t xml:space="preserve">— doorknob side, place shims at same height as top and bottom hinge</w:t>
-      </w:r>
-      <w:r>
-        <w:t xml:space="preserve"> </w:t>
-      </w:r>
-      <w:r>
-        <w:t xml:space="preserve">— Adjust side shims so the gap at the top is the same across door width</w:t>
-      </w:r>
-      <w:r>
-        <w:br/>
-      </w:r>
-      <w:r>
-        <w:t xml:space="preserve">shims and just above doorknob opening</w:t>
+        <w:t xml:space="preserve">Helpers hold door frame tight against siding</w:t>
       </w:r>
     </w:p>
     <w:p>
@@ -486,13 +414,31 @@
         </w:numPr>
       </w:pPr>
       <w:r>
-        <w:t xml:space="preserve">Adjust and secure door frame</w:t>
-      </w:r>
-      <w:r>
-        <w:br/>
-      </w:r>
-      <w:r>
-        <w:t xml:space="preserve">— Open &amp; close door - it should not hit door frame (~1/8” gap)</w:t>
+        <w:t xml:space="preserve">Insert SHIMS as necessary to center the door in the opening and tighten any spaces</w:t>
+      </w:r>
+      <w:r>
+        <w:br/>
+      </w:r>
+      <w:r>
+        <w:t xml:space="preserve">— hinge side, place shims just above each hinge</w:t>
+      </w:r>
+      <w:r>
+        <w:br/>
+      </w:r>
+      <w:r>
+        <w:t xml:space="preserve">— doorknob side, place shims at same height as top and bottom hinge</w:t>
+      </w:r>
+      <w:r>
+        <w:t xml:space="preserve"> </w:t>
+      </w:r>
+      <w:r>
+        <w:t xml:space="preserve">— Adjust side shims so the gap at the top is the same across door width</w:t>
+      </w:r>
+      <w:r>
+        <w:br/>
+      </w:r>
+      <w:r>
+        <w:t xml:space="preserve">shims and just above doorknob opening</w:t>
       </w:r>
     </w:p>
     <w:p>
@@ -503,31 +449,13 @@
         </w:numPr>
       </w:pPr>
       <w:r>
-        <w:t xml:space="preserve">Screw door frame to the opening on the hinge side</w:t>
-      </w:r>
-      <w:r>
-        <w:br/>
-      </w:r>
-      <w:r>
-        <w:t xml:space="preserve">— open the door</w:t>
-      </w:r>
-      <w:r>
-        <w:br/>
-      </w:r>
-      <w:r>
-        <w:t xml:space="preserve">— helper holds weatherstripping out of the way</w:t>
-      </w:r>
-      <w:r>
-        <w:br/>
-      </w:r>
-      <w:r>
-        <w:t xml:space="preserve">— make sure door molding is tight against the siding</w:t>
-      </w:r>
-      <w:r>
-        <w:t xml:space="preserve"> </w:t>
-      </w:r>
-      <w:r>
-        <w:t xml:space="preserve">— install 3” (brown) screws just behind the weatherstripping at the height of the center of each shim, starting at the top</w:t>
+        <w:t xml:space="preserve">Adjust and secure door frame</w:t>
+      </w:r>
+      <w:r>
+        <w:br/>
+      </w:r>
+      <w:r>
+        <w:t xml:space="preserve">— Open &amp; close door - it should not hit door frame on the side opposite the hinges (~1/8” gap)</w:t>
       </w:r>
     </w:p>
     <w:p>
@@ -538,6 +466,35 @@
         </w:numPr>
       </w:pPr>
       <w:r>
+        <w:t xml:space="preserve">Screw door frame to the opening on the hinge side</w:t>
+      </w:r>
+      <w:r>
+        <w:br/>
+      </w:r>
+      <w:r>
+        <w:t xml:space="preserve">— open the door</w:t>
+      </w:r>
+      <w:r>
+        <w:br/>
+      </w:r>
+      <w:r>
+        <w:t xml:space="preserve">— make sure door molding is tight against the siding</w:t>
+      </w:r>
+      <w:r>
+        <w:t xml:space="preserve"> </w:t>
+      </w:r>
+      <w:r>
+        <w:t xml:space="preserve">— install 3” (brown) screws very close to the doorstop at the height of the center of each shim, starting at the top</w:t>
+      </w:r>
+    </w:p>
+    <w:p>
+      <w:pPr>
+        <w:numPr>
+          <w:ilvl w:val="0"/>
+          <w:numId w:val="1004"/>
+        </w:numPr>
+      </w:pPr>
+      <w:r>
         <w:t xml:space="preserve">Screw door frame to the opening on doorknob side</w:t>
       </w:r>
       <w:r>
@@ -560,15 +517,6 @@
       </w:r>
       <w:r>
         <w:br/>
-      </w:r>
-      <w:r>
-        <w:t xml:space="preserve">— insert shims both above and below the latch hole</w:t>
-      </w:r>
-      <w:r>
-        <w:br/>
-      </w:r>
-      <w:r>
-        <w:t xml:space="preserve">— adjust shims above and below latch hole so the gap between door and door jamb is approximately 1/8”</w:t>
       </w:r>
     </w:p>
     <w:p>
@@ -638,6 +586,18 @@
         <w:br/>
       </w:r>
       <w:r>
+        <w:t xml:space="preserve">— insert shims both above and below the latch hole</w:t>
+      </w:r>
+      <w:r>
+        <w:br/>
+      </w:r>
+      <w:r>
+        <w:t xml:space="preserve">— adjust shims above and below latch hole so the gap between door and door jamb is approximately 1/8”</w:t>
+      </w:r>
+      <w:r>
+        <w:br/>
+      </w:r>
+      <w:r>
         <w:t xml:space="preserve">— Drill with countersink bit above and below the latch hole, as shown in the drawing</w:t>
       </w:r>
       <w:r>
@@ -668,7 +628,7 @@
         <w:t xml:space="preserve"> </w:t>
       </w:r>
       <w:r>
-        <w:t xml:space="preserve">then use a piece of scrap plywood like pieces used around the inside of the windows, and then shims</w:t>
+        <w:t xml:space="preserve">then use a piece of 3/4” plywood, and then shims</w:t>
       </w:r>
     </w:p>
     <w:p>
@@ -692,7 +652,7 @@
         </w:numPr>
       </w:pPr>
       <w:r>
-        <w:t xml:space="preserve">Install screws as for the sides, behind the weatherstripping.</w:t>
+        <w:t xml:space="preserve">Install screws as for the sides.</w:t>
       </w:r>
     </w:p>
     <w:p>
@@ -745,18 +705,6 @@
       </w:pPr>
       <w:r>
         <w:t xml:space="preserve">Trim off the protruding ends of the shims, flush with the wall plywood. Use a box knife to score the shim, and then snap it off.</w:t>
-      </w:r>
-    </w:p>
-    <w:p>
-      <w:pPr>
-        <w:pStyle w:val="Compact"/>
-        <w:numPr>
-          <w:ilvl w:val="0"/>
-          <w:numId w:val="1006"/>
-        </w:numPr>
-      </w:pPr>
-      <w:r>
-        <w:t xml:space="preserve">Remove the weatherstripping from the top and sides of the door frame, using the wide-jawed pliers to get each strip started. Save these pieces of weatherstripping. There is a collection on top of the shelving between Paint Bay C and the area where personal belongings are stowed.</w:t>
       </w:r>
     </w:p>
     <w:p>

</xml_diff>